<commit_message>
feat(hybrid): complete Step 15 hybrid automation baseline
</commit_message>
<xml_diff>
--- a/docs/AE-AS-001_Automation_Scope.docx
+++ b/docs/AE-AS-001_Automation_Scope.docx
@@ -122,7 +122,7 @@
           </w:tcPr>
           <w:p>
             <w:r>
-              <w:t>1.0</w:t>
+              <w:t>1.1</w:t>
             </w:r>
           </w:p>
         </w:tc>
@@ -144,7 +144,7 @@
           </w:tcPr>
           <w:p>
             <w:r>
-              <w:t>Baselined</w:t>
+              <w:t>Baselined (Phase 1 UI+API); Hybrid Scope Addendum Pending Approval</w:t>
             </w:r>
           </w:p>
         </w:tc>
@@ -277,6 +277,153 @@
           <w:p>
             <w:r>
               <w:t>Md. Shariful Islam</w:t>
+            </w:r>
+          </w:p>
+        </w:tc>
+      </w:tr>
+    </w:tbl>
+    <w:p>
+      <w:pPr>
+        <w:pStyle w:val="Heading1"/>
+      </w:pPr>
+      <w:r>
+        <w:t>Revision History</w:t>
+      </w:r>
+    </w:p>
+    <w:tbl>
+      <w:tblPr>
+        <w:tblStyle w:val="TableGrid"/>
+        <w:tblW w:type="auto" w:w="0"/>
+        <w:tblLook w:firstColumn="1" w:firstRow="1" w:lastColumn="0" w:lastRow="0" w:noHBand="0" w:noVBand="1" w:val="04A0"/>
+      </w:tblPr>
+      <w:tblGrid>
+        <w:gridCol w:w="1440"/>
+        <w:gridCol w:w="2160"/>
+        <w:gridCol w:w="3600"/>
+        <w:gridCol w:w="2160"/>
+      </w:tblGrid>
+      <w:tr>
+        <w:tc>
+          <w:tcPr>
+            <w:tcW w:type="dxa" w:w="1440"/>
+          </w:tcPr>
+          <w:p>
+            <w:r>
+              <w:t>Version</w:t>
+            </w:r>
+          </w:p>
+        </w:tc>
+        <w:tc>
+          <w:tcPr>
+            <w:tcW w:type="dxa" w:w="2160"/>
+          </w:tcPr>
+          <w:p>
+            <w:r>
+              <w:t>Date</w:t>
+            </w:r>
+          </w:p>
+        </w:tc>
+        <w:tc>
+          <w:tcPr>
+            <w:tcW w:type="dxa" w:w="3600"/>
+          </w:tcPr>
+          <w:p>
+            <w:r>
+              <w:t>Change</w:t>
+            </w:r>
+          </w:p>
+        </w:tc>
+        <w:tc>
+          <w:tcPr>
+            <w:tcW w:type="dxa" w:w="2160"/>
+          </w:tcPr>
+          <w:p>
+            <w:r>
+              <w:t>Status</w:t>
+            </w:r>
+          </w:p>
+        </w:tc>
+      </w:tr>
+      <w:tr>
+        <w:tc>
+          <w:tcPr>
+            <w:tcW w:type="dxa" w:w="1440"/>
+          </w:tcPr>
+          <w:p>
+            <w:r>
+              <w:t>1.0</w:t>
+            </w:r>
+          </w:p>
+        </w:tc>
+        <w:tc>
+          <w:tcPr>
+            <w:tcW w:type="dxa" w:w="2160"/>
+          </w:tcPr>
+          <w:p>
+            <w:r>
+              <w:t>Phase 1</w:t>
+            </w:r>
+          </w:p>
+        </w:tc>
+        <w:tc>
+          <w:tcPr>
+            <w:tcW w:type="dxa" w:w="3600"/>
+          </w:tcPr>
+          <w:p>
+            <w:r>
+              <w:t>Initial approved scope: 24 UI + 8 API test cases (32 total).</w:t>
+            </w:r>
+          </w:p>
+        </w:tc>
+        <w:tc>
+          <w:tcPr>
+            <w:tcW w:type="dxa" w:w="2160"/>
+          </w:tcPr>
+          <w:p>
+            <w:r>
+              <w:t>Baselined</w:t>
+            </w:r>
+          </w:p>
+        </w:tc>
+      </w:tr>
+      <w:tr>
+        <w:tc>
+          <w:tcPr>
+            <w:tcW w:type="dxa" w:w="1440"/>
+          </w:tcPr>
+          <w:p>
+            <w:r>
+              <w:t>1.1</w:t>
+            </w:r>
+          </w:p>
+        </w:tc>
+        <w:tc>
+          <w:tcPr>
+            <w:tcW w:type="dxa" w:w="2160"/>
+          </w:tcPr>
+          <w:p>
+            <w:r>
+              <w:t>Step 15</w:t>
+            </w:r>
+          </w:p>
+        </w:tc>
+        <w:tc>
+          <w:tcPr>
+            <w:tcW w:type="dxa" w:w="3600"/>
+          </w:tcPr>
+          <w:p>
+            <w:r>
+              <w:t>Added Section 13, Hybrid Automation Scope, documenting 2 approved-for-planning Hybrid test cases (AE-TC-HYBRID-001, AE-TC-HYBRID-002). No change to the Phase 1 baseline described above.</w:t>
+            </w:r>
+          </w:p>
+        </w:tc>
+        <w:tc>
+          <w:tcPr>
+            <w:tcW w:type="dxa" w:w="2160"/>
+          </w:tcPr>
+          <w:p>
+            <w:r>
+              <w:t>Pending Approval</w:t>
             </w:r>
           </w:p>
         </w:tc>
@@ -1526,6 +1673,249 @@
         </w:tc>
       </w:tr>
     </w:tbl>
+    <w:p>
+      <w:r>
+        <w:br w:type="page"/>
+      </w:r>
+    </w:p>
+    <w:p>
+      <w:pPr>
+        <w:pStyle w:val="Heading1"/>
+      </w:pPr>
+      <w:r>
+        <w:t>13. Hybrid Automation Scope (Step 15)</w:t>
+      </w:r>
+    </w:p>
+    <w:tbl>
+      <w:tblPr>
+        <w:tblStyle w:val="TableGrid"/>
+        <w:tblW w:type="auto" w:w="0"/>
+        <w:tblLook w:firstColumn="1" w:firstRow="1" w:lastColumn="0" w:lastRow="0" w:noHBand="0" w:noVBand="1" w:val="04A0"/>
+      </w:tblPr>
+      <w:tblGrid>
+        <w:gridCol w:w="2880"/>
+        <w:gridCol w:w="5760"/>
+      </w:tblGrid>
+      <w:tr>
+        <w:tc>
+          <w:tcPr>
+            <w:tcW w:type="dxa" w:w="2880"/>
+          </w:tcPr>
+          <w:p>
+            <w:r>
+              <w:t>Field</w:t>
+            </w:r>
+          </w:p>
+        </w:tc>
+        <w:tc>
+          <w:tcPr>
+            <w:tcW w:type="dxa" w:w="5760"/>
+          </w:tcPr>
+          <w:p>
+            <w:r>
+              <w:t>Value</w:t>
+            </w:r>
+          </w:p>
+        </w:tc>
+      </w:tr>
+      <w:tr>
+        <w:tc>
+          <w:tcPr>
+            <w:tcW w:type="dxa" w:w="2880"/>
+          </w:tcPr>
+          <w:p>
+            <w:r>
+              <w:t>Current Status</w:t>
+            </w:r>
+          </w:p>
+        </w:tc>
+        <w:tc>
+          <w:tcPr>
+            <w:tcW w:type="dxa" w:w="5760"/>
+          </w:tcPr>
+          <w:p>
+            <w:r>
+              <w:t>Proposed - Planning complete, pending architecture approval. No Hybrid test code exists yet as of this revision; Step 13 (UI), Step 13.5, Step 14 (API), and Step 14.5 remain the only baselined automation work (tags v1.0.0-batch1, v1.0.0-batch2, v1.0.0-batch3, v1.0.0-api).</w:t>
+            </w:r>
+          </w:p>
+        </w:tc>
+      </w:tr>
+      <w:tr>
+        <w:tc>
+          <w:tcPr>
+            <w:tcW w:type="dxa" w:w="2880"/>
+          </w:tcPr>
+          <w:p>
+            <w:r>
+              <w:t>Purpose</w:t>
+            </w:r>
+          </w:p>
+        </w:tc>
+        <w:tc>
+          <w:tcPr>
+            <w:tcW w:type="dxa" w:w="5760"/>
+          </w:tcPr>
+          <w:p>
+            <w:r>
+              <w:t>Combine API-based test data setup/cleanup with UI-based business-flow validation for a small number of flows where API setup provides a clear, justified engineering benefit over UI setup (speed and/or test isolation), following the pattern defined in AE-TS-001 Section 5. Hybrid Automation is not intended to demonstrate that API and UI can exist in the same test; every Hybrid test case must independently justify its own value.</w:t>
+            </w:r>
+          </w:p>
+        </w:tc>
+      </w:tr>
+      <w:tr>
+        <w:tc>
+          <w:tcPr>
+            <w:tcW w:type="dxa" w:w="2880"/>
+          </w:tcPr>
+          <w:p>
+            <w:r>
+              <w:t>Included Scope</w:t>
+            </w:r>
+          </w:p>
+        </w:tc>
+        <w:tc>
+          <w:tcPr>
+            <w:tcW w:type="dxa" w:w="5760"/>
+          </w:tcPr>
+          <w:p>
+            <w:pPr>
+              <w:pStyle w:val="ListBullet"/>
+            </w:pPr>
+            <w:r>
+              <w:t>AE-TC-HYBRID-001 - Verify login via API-provisioned account (see AE-TC-001 Section 9).</w:t>
+            </w:r>
+          </w:p>
+          <w:p>
+            <w:pPr>
+              <w:pStyle w:val="ListBullet"/>
+            </w:pPr>
+            <w:r>
+              <w:t>AE-TC-HYBRID-002 - Checkout completion for an API-provisioned account (see AE-TC-001 Section 9).</w:t>
+            </w:r>
+          </w:p>
+          <w:p>
+            <w:pPr>
+              <w:pStyle w:val="ListBullet"/>
+            </w:pPr>
+            <w:r>
+              <w:t>Reuse of AuthApiClient.createAccount/deleteAccount (Step 14) strictly as setup/cleanup helpers, not as independently tested scenarios.</w:t>
+            </w:r>
+          </w:p>
+        </w:tc>
+      </w:tr>
+      <w:tr>
+        <w:tc>
+          <w:tcPr>
+            <w:tcW w:type="dxa" w:w="2880"/>
+          </w:tcPr>
+          <w:p>
+            <w:r>
+              <w:t>Excluded Scope</w:t>
+            </w:r>
+          </w:p>
+        </w:tc>
+        <w:tc>
+          <w:tcPr>
+            <w:tcW w:type="dxa" w:w="5760"/>
+          </w:tcPr>
+          <w:p>
+            <w:pPr>
+              <w:pStyle w:val="ListBullet"/>
+            </w:pPr>
+            <w:r>
+              <w:t>Create Account, Delete Account, Update Account, and Get User Detail as standalone automated test cases - these remain deferred per AE-TC-001 Section 6 (Deferred / Future Scope Coverage) and are not promoted to approved scope by this addendum.</w:t>
+            </w:r>
+          </w:p>
+          <w:p>
+            <w:pPr>
+              <w:pStyle w:val="ListBullet"/>
+            </w:pPr>
+            <w:r>
+              <w:t>Verify Login without email and DELETE Verify Login - remain deferred per AE-TC-001 Section 6.</w:t>
+            </w:r>
+          </w:p>
+          <w:p>
+            <w:pPr>
+              <w:pStyle w:val="ListBullet"/>
+            </w:pPr>
+            <w:r>
+              <w:t>A "create user via API, verify account-related UI behavior, delete via API" flow - rejected during Step 15 planning; no distinct UI behavior beyond what AE-TC-HYBRID-001 and the existing UI test cases already validate.</w:t>
+            </w:r>
+          </w:p>
+          <w:p>
+            <w:pPr>
+              <w:pStyle w:val="ListBullet"/>
+            </w:pPr>
+            <w:r>
+              <w:t>A "prepare cart/checkout test data via API" flow - rejected during Step 15 planning; no product or cart mutation API exists in this application.</w:t>
+            </w:r>
+          </w:p>
+        </w:tc>
+      </w:tr>
+      <w:tr>
+        <w:tc>
+          <w:tcPr>
+            <w:tcW w:type="dxa" w:w="2880"/>
+          </w:tcPr>
+          <w:p>
+            <w:r>
+              <w:t>Future Expansion</w:t>
+            </w:r>
+          </w:p>
+        </w:tc>
+        <w:tc>
+          <w:tcPr>
+            <w:tcW w:type="dxa" w:w="5760"/>
+          </w:tcPr>
+          <w:p>
+            <w:r>
+              <w:t>AE-TS-001 Section 5 describes a full pattern of "API creates data, UI validates data, user performs actions, API validates backend state." The two Hybrid test cases in this addendum exercise only the first half of that pattern (API creates, UI validates). A natural future expansion is closing the loop with a post-UI-action API validation step, if and when a suitable read endpoint becomes part of the approved API scope.</w:t>
+            </w:r>
+          </w:p>
+        </w:tc>
+      </w:tr>
+      <w:tr>
+        <w:tc>
+          <w:tcPr>
+            <w:tcW w:type="dxa" w:w="2880"/>
+          </w:tcPr>
+          <w:p>
+            <w:r>
+              <w:t>Dependencies on UI and API Layers</w:t>
+            </w:r>
+          </w:p>
+        </w:tc>
+        <w:tc>
+          <w:tcPr>
+            <w:tcW w:type="dxa" w:w="5760"/>
+          </w:tcPr>
+          <w:p>
+            <w:pPr>
+              <w:pStyle w:val="ListBullet"/>
+            </w:pPr>
+            <w:r>
+              <w:t>Depends on AuthApiClient.createAccount/deleteAccount (src/api/clients/AuthApiClient.ts), baselined under Step 14 / v1.0.0-api.</w:t>
+            </w:r>
+          </w:p>
+          <w:p>
+            <w:pPr>
+              <w:pStyle w:val="ListBullet"/>
+            </w:pPr>
+            <w:r>
+              <w:t>Depends on HomePage, SignupLoginPage, ProductsPage, ProductDetailsPage, CartPage, CheckoutPage, and PaymentPage (src/pages/), baselined under Steps 13/13.5 / v1.0.0-batch1, v1.0.0-batch2, v1.0.0-batch3.</w:t>
+            </w:r>
+          </w:p>
+          <w:p>
+            <w:pPr>
+              <w:pStyle w:val="ListBullet"/>
+            </w:pPr>
+            <w:r>
+              <w:t>Hybrid Automation cannot be baselined independently of these two layers; any breaking change to the public methods listed above directly affects Hybrid test reliability.</w:t>
+            </w:r>
+          </w:p>
+        </w:tc>
+      </w:tr>
+    </w:tbl>
     <w:sectPr>
       <w:pgSz w:w="12240" w:h="15840"/>
       <w:pgMar w:top="1440" w:right="1800" w:bottom="1440" w:left="1800" w:header="720" w:footer="720" w:gutter="0"/>

</xml_diff>